<commit_message>
Fix bugs thesis title permanent + in scrap add url too
</commit_message>
<xml_diff>
--- a/TEMPLATE/TEMPLATE_CV.docx
+++ b/TEMPLATE/TEMPLATE_CV.docx
@@ -1012,11 +1012,13 @@
       </w:r>
       <w:r>
         <w:rPr>
-          <w:rFonts w:ascii="Roboto" w:hAnsi="Roboto"/>
+          <w:rFonts w:ascii="Roboto" w:hAnsi="Roboto" w:cstheme="minorHAnsi"/>
+          <w:i/>
+          <w:iCs/>
           <w:sz w:val="22"/>
           <w:szCs w:val="22"/>
         </w:rPr>
-        <w:t>{{THESIS_REPLACE}}</w:t>
+        <w:t>Prototyping an Automated Ethical Decision-Making Support Tool for Software Project Management using Ethical Framework and LLMs (ECCOLA, GPT-3.5)</w:t>
       </w:r>
     </w:p>
     <w:p>

</xml_diff>

<commit_message>
SCHEME PROMPT TAKEN FROM VARIABLE NOT HARDCODE
</commit_message>
<xml_diff>
--- a/TEMPLATE/TEMPLATE_CV.docx
+++ b/TEMPLATE/TEMPLATE_CV.docx
@@ -504,6 +504,16 @@
     </w:p>
     <w:p>
       <w:pPr>
+        <w:spacing w:after="0" w:line="240" w:lineRule="auto"/>
+        <w:rPr>
+          <w:rFonts w:ascii="Roboto" w:hAnsi="Roboto"/>
+          <w:sz w:val="22"/>
+          <w:szCs w:val="22"/>
+        </w:rPr>
+      </w:pPr>
+    </w:p>
+    <w:p>
+      <w:pPr>
         <w:pStyle w:val="ListParagraph"/>
         <w:numPr>
           <w:ilvl w:val="0"/>
@@ -560,15 +570,7 @@
           <w:sz w:val="22"/>
           <w:szCs w:val="22"/>
         </w:rPr>
-        <w:t>{{</w:t>
-      </w:r>
-      <w:r>
-        <w:rPr>
-          <w:rFonts w:ascii="Roboto" w:hAnsi="Roboto"/>
-          <w:sz w:val="22"/>
-          <w:szCs w:val="22"/>
-        </w:rPr>
-        <w:t>EXP_PROJECT_ITEM}}</w:t>
+        <w:t>{{EXP_PROJECT_ITEM}}</w:t>
       </w:r>
     </w:p>
     <w:p>
@@ -581,11 +583,6 @@
         </w:rPr>
       </w:pPr>
       <w:r>
-        <w:rPr>
-          <w:rFonts w:ascii="Roboto" w:hAnsi="Roboto"/>
-          <w:sz w:val="22"/>
-          <w:szCs w:val="22"/>
-        </w:rPr>
         <w:pict w14:anchorId="7CEA766F">
           <v:rect id="_x0000_i1030" style="width:0;height:1.5pt" o:hralign="center" o:hrstd="t" o:hr="t" fillcolor="#a0a0a0" stroked="f"/>
         </w:pict>

</xml_diff>

<commit_message>
FIX MAJOR BUGS: JSON ERROR WHEN AWARD GIVEN OR EXPERIENCE.PROJECT NOT GIVEN
</commit_message>
<xml_diff>
--- a/TEMPLATE/TEMPLATE_CV.docx
+++ b/TEMPLATE/TEMPLATE_CV.docx
@@ -499,7 +499,7 @@
           <w:sz w:val="22"/>
           <w:szCs w:val="22"/>
         </w:rPr>
-        <w:t>{{EXP _ITEM}}</w:t>
+        <w:t>{{EXP_ITEM}}</w:t>
       </w:r>
     </w:p>
     <w:p>
@@ -904,25 +904,7 @@
           <w:i/>
           <w:iCs/>
         </w:rPr>
-        <w:t xml:space="preserve">Università degli Studi </w:t>
-      </w:r>
-      <w:proofErr w:type="spellStart"/>
-      <w:r>
-        <w:rPr>
-          <w:rFonts w:ascii="Roboto" w:hAnsi="Roboto" w:cstheme="minorHAnsi"/>
-          <w:i/>
-          <w:iCs/>
-        </w:rPr>
-        <w:t>dell’Aquila</w:t>
-      </w:r>
-      <w:proofErr w:type="spellEnd"/>
-      <w:r>
-        <w:rPr>
-          <w:rFonts w:ascii="Roboto" w:hAnsi="Roboto" w:cstheme="minorHAnsi"/>
-          <w:i/>
-          <w:iCs/>
-        </w:rPr>
-        <w:t xml:space="preserve"> (Italy) · LUT University (Finland) · Vrije Universiteit Amsterdam (Netherlands) · Chalmers University of Technology (Sweden)</w:t>
+        <w:t>Università degli Studi dell’Aquila (Italy) · LUT University (Finland) · Vrije Universiteit Amsterdam (Netherlands) · Chalmers University of Technology (Sweden)</w:t>
       </w:r>
       <w:r>
         <w:rPr>

</xml_diff>

<commit_message>
ADVANCE PROMPT ENGINEERING WITH CONTEXT
</commit_message>
<xml_diff>
--- a/TEMPLATE/TEMPLATE_CV.docx
+++ b/TEMPLATE/TEMPLATE_CV.docx
@@ -904,7 +904,25 @@
           <w:i/>
           <w:iCs/>
         </w:rPr>
-        <w:t>Università degli Studi dell’Aquila (Italy) · LUT University (Finland) · Vrije Universiteit Amsterdam (Netherlands) · Chalmers University of Technology (Sweden)</w:t>
+        <w:t xml:space="preserve">Università degli Studi </w:t>
+      </w:r>
+      <w:proofErr w:type="spellStart"/>
+      <w:r>
+        <w:rPr>
+          <w:rFonts w:ascii="Roboto" w:hAnsi="Roboto" w:cstheme="minorHAnsi"/>
+          <w:i/>
+          <w:iCs/>
+        </w:rPr>
+        <w:t>dell’Aquila</w:t>
+      </w:r>
+      <w:proofErr w:type="spellEnd"/>
+      <w:r>
+        <w:rPr>
+          <w:rFonts w:ascii="Roboto" w:hAnsi="Roboto" w:cstheme="minorHAnsi"/>
+          <w:i/>
+          <w:iCs/>
+        </w:rPr>
+        <w:t xml:space="preserve"> (Italy) · LUT University (Finland) · Vrije Universiteit Amsterdam (Netherlands) · Chalmers University of Technology (Sweden)</w:t>
       </w:r>
       <w:r>
         <w:rPr>
@@ -1123,6 +1141,62 @@
         </w:rPr>
         <w:t>{{AWARDS_BULLET}}</w:t>
       </w:r>
+    </w:p>
+    <w:p>
+      <w:pPr>
+        <w:spacing w:after="0" w:line="240" w:lineRule="auto"/>
+        <w:ind w:right="-285"/>
+        <w:rPr>
+          <w:rFonts w:ascii="Roboto" w:hAnsi="Roboto"/>
+          <w:sz w:val="22"/>
+          <w:szCs w:val="22"/>
+        </w:rPr>
+        <w:sectPr>
+          <w:pgSz w:w="11906" w:h="16838" w:code="9"/>
+          <w:pgMar w:top="142" w:right="567" w:bottom="28" w:left="567" w:header="720" w:footer="720" w:gutter="0"/>
+          <w:cols w:space="720"/>
+          <w:docGrid w:linePitch="360"/>
+        </w:sectPr>
+      </w:pPr>
+    </w:p>
+    <w:p>
+      <w:pPr>
+        <w:spacing w:after="0" w:line="240" w:lineRule="auto"/>
+        <w:ind w:right="-285"/>
+        <w:rPr>
+          <w:rFonts w:ascii="Roboto" w:hAnsi="Roboto"/>
+          <w:sz w:val="22"/>
+          <w:szCs w:val="22"/>
+        </w:rPr>
+      </w:pPr>
+    </w:p>
+    <w:p>
+      <w:pPr>
+        <w:spacing w:after="0" w:line="240" w:lineRule="auto"/>
+        <w:ind w:right="-285"/>
+        <w:rPr>
+          <w:rFonts w:ascii="Roboto" w:hAnsi="Roboto"/>
+          <w:sz w:val="22"/>
+          <w:szCs w:val="22"/>
+        </w:rPr>
+        <w:sectPr>
+          <w:pgSz w:w="11906" w:h="16838" w:code="9"/>
+          <w:pgMar w:top="142" w:right="567" w:bottom="28" w:left="567" w:header="720" w:footer="720" w:gutter="0"/>
+          <w:cols w:space="720"/>
+          <w:docGrid w:linePitch="360"/>
+        </w:sectPr>
+      </w:pPr>
+    </w:p>
+    <w:p>
+      <w:pPr>
+        <w:spacing w:after="0" w:line="240" w:lineRule="auto"/>
+        <w:ind w:right="-285"/>
+        <w:rPr>
+          <w:rFonts w:ascii="Roboto" w:hAnsi="Roboto"/>
+          <w:sz w:val="22"/>
+          <w:szCs w:val="22"/>
+        </w:rPr>
+      </w:pPr>
     </w:p>
     <w:sectPr>
       <w:pgSz w:w="11906" w:h="16838" w:code="9"/>

</xml_diff>